<commit_message>
feat: enterprise-grade professional styling for .docx reports
- Add tools/docx_styles.py: reusable styling system with modern color palette
  (dark navy/steel blue), professional typography (Calibri Light headings),
  custom table styles with dark headers + alternating rows, headers/footers
  with page numbers, cover page with accent lines, callout boxes, stat blocks,
  and severity badges
- Rewrite DQR and Profile Report generation in docs_cli.py to use new styling
- Add tools/generate_docx_templates.py for regenerating template files
- Update templates/profile_report_template.docx and dqr_template.docx
  with the new enterprise-grade design
</commit_message>
<xml_diff>
--- a/templates/dqr_template.docx
+++ b/templates/dqr_template.docx
@@ -4,66 +4,118 @@
   <w:body>
     <w:p/>
     <w:p/>
+    <w:p/>
+    <w:p/>
     <w:p>
       <w:pPr>
-        <w:jc w:val="center"/>
+        <w:pBdr>
+          <w:bottom w:val="single" w:sz="24" w:space="1" w:color="1B2A4A"/>
+        </w:pBdr>
+      </w:pPr>
+    </w:p>
+    <w:p/>
+    <w:p>
+      <w:pPr>
+        <w:jc w:val="left"/>
       </w:pPr>
       <w:r>
         <w:rPr>
-          <w:b/>
-          <w:color w:val="2E74B5"/>
-          <w:sz w:val="56"/>
+          <w:rFonts w:ascii="Calibri Light" w:hAnsi="Calibri Light"/>
+          <w:b w:val="0"/>
+          <w:color w:val="1B2A4A"/>
+          <w:sz w:val="72"/>
         </w:rPr>
         <w:t>Data Quality Review</w:t>
       </w:r>
     </w:p>
-    <w:p/>
     <w:p>
       <w:pPr>
-        <w:jc w:val="center"/>
+        <w:jc w:val="left"/>
       </w:pPr>
       <w:r>
         <w:rPr>
-          <w:color w:val="595959"/>
-          <w:sz w:val="36"/>
+          <w:rFonts w:ascii="Calibri Light" w:hAnsi="Calibri Light"/>
+          <w:color w:val="2E5C8A"/>
+          <w:sz w:val="40"/>
         </w:rPr>
         <w:t>{{CUSTOMER}}</w:t>
       </w:r>
     </w:p>
     <w:p/>
+    <w:p/>
     <w:p>
       <w:pPr>
-        <w:jc w:val="center"/>
+        <w:spacing w:after="40"/>
       </w:pPr>
       <w:r>
         <w:rPr>
-          <w:sz w:val="24"/>
+          <w:rFonts w:ascii="Calibri" w:hAnsi="Calibri"/>
+          <w:b/>
+          <w:color w:val="5A5A65"/>
+          <w:sz w:val="22"/>
         </w:rPr>
-        <w:t xml:space="preserve">Prepared by: </w:t>
+        <w:t xml:space="preserve">Prepared by:  </w:t>
       </w:r>
       <w:r>
         <w:rPr>
-          <w:sz w:val="24"/>
+          <w:rFonts w:ascii="Calibri" w:hAnsi="Calibri"/>
+          <w:color w:val="33333B"/>
+          <w:sz w:val="22"/>
         </w:rPr>
         <w:t>{{VENDOR}}</w:t>
       </w:r>
     </w:p>
     <w:p>
       <w:pPr>
-        <w:jc w:val="center"/>
+        <w:spacing w:after="40"/>
       </w:pPr>
       <w:r>
         <w:rPr>
-          <w:sz w:val="24"/>
+          <w:rFonts w:ascii="Calibri" w:hAnsi="Calibri"/>
+          <w:b/>
+          <w:color w:val="5A5A65"/>
+          <w:sz w:val="22"/>
         </w:rPr>
-        <w:t xml:space="preserve">Date: </w:t>
+        <w:t xml:space="preserve">Date:  </w:t>
       </w:r>
       <w:r>
         <w:rPr>
-          <w:sz w:val="24"/>
+          <w:rFonts w:ascii="Calibri" w:hAnsi="Calibri"/>
+          <w:color w:val="33333B"/>
+          <w:sz w:val="22"/>
         </w:rPr>
         <w:t>{{DATE}}</w:t>
       </w:r>
+    </w:p>
+    <w:p>
+      <w:pPr>
+        <w:spacing w:after="40"/>
+      </w:pPr>
+      <w:r>
+        <w:rPr>
+          <w:rFonts w:ascii="Calibri" w:hAnsi="Calibri"/>
+          <w:b/>
+          <w:color w:val="5A5A65"/>
+          <w:sz w:val="22"/>
+        </w:rPr>
+        <w:t xml:space="preserve">Classification:  </w:t>
+      </w:r>
+      <w:r>
+        <w:rPr>
+          <w:rFonts w:ascii="Calibri" w:hAnsi="Calibri"/>
+          <w:color w:val="33333B"/>
+          <w:sz w:val="22"/>
+        </w:rPr>
+        <w:t>Confidential</w:t>
+      </w:r>
+    </w:p>
+    <w:p/>
+    <w:p>
+      <w:pPr>
+        <w:pBdr>
+          <w:bottom w:val="single" w:sz="8" w:space="1" w:color="2E5C8A"/>
+        </w:pBdr>
+      </w:pPr>
     </w:p>
     <w:p>
       <w:r>
@@ -78,46 +130,692 @@
         <w:t>Executive Summary</w:t>
       </w:r>
     </w:p>
+    <w:tbl>
+      <w:tblPr>
+        <w:tblW w:type="auto" w:w="0"/>
+        <w:jc w:val="center"/>
+        <w:tblLook w:firstColumn="1" w:firstRow="1" w:lastColumn="0" w:lastRow="0" w:noHBand="0" w:noVBand="1" w:val="04A0"/>
+        <w:tblBorders>
+          <w:top w:val="none" w:sz="0" w:space="0" w:color="auto"/>
+          <w:left w:val="none" w:sz="0" w:space="0" w:color="auto"/>
+          <w:bottom w:val="none" w:sz="0" w:space="0" w:color="auto"/>
+          <w:right w:val="none" w:sz="0" w:space="0" w:color="auto"/>
+          <w:insideH w:val="none" w:sz="0" w:space="0" w:color="auto"/>
+          <w:insideV w:val="single" w:sz="4" w:space="0" w:color="D0D0D8"/>
+        </w:tblBorders>
+      </w:tblPr>
+      <w:tblGrid>
+        <w:gridCol w:w="2268"/>
+        <w:gridCol w:w="2268"/>
+        <w:gridCol w:w="2268"/>
+        <w:gridCol w:w="2268"/>
+      </w:tblGrid>
+      <w:tr>
+        <w:tc>
+          <w:tcPr>
+            <w:tcW w:type="dxa" w:w="2268"/>
+          </w:tcPr>
+          <w:p>
+            <w:pPr>
+              <w:jc w:val="center"/>
+            </w:pPr>
+            <w:r/>
+            <w:r>
+              <w:rPr>
+                <w:rFonts w:ascii="Calibri Light" w:hAnsi="Calibri Light"/>
+                <w:b/>
+                <w:color w:val="1B2A4A"/>
+                <w:sz w:val="56"/>
+              </w:rPr>
+              <w:t>{{N}}</w:t>
+            </w:r>
+          </w:p>
+        </w:tc>
+        <w:tc>
+          <w:tcPr>
+            <w:tcW w:type="dxa" w:w="2268"/>
+          </w:tcPr>
+          <w:p>
+            <w:pPr>
+              <w:jc w:val="center"/>
+            </w:pPr>
+            <w:r/>
+            <w:r>
+              <w:rPr>
+                <w:rFonts w:ascii="Calibri Light" w:hAnsi="Calibri Light"/>
+                <w:b/>
+                <w:color w:val="1B2A4A"/>
+                <w:sz w:val="56"/>
+              </w:rPr>
+              <w:t>{{N}}</w:t>
+            </w:r>
+          </w:p>
+        </w:tc>
+        <w:tc>
+          <w:tcPr>
+            <w:tcW w:type="dxa" w:w="2268"/>
+          </w:tcPr>
+          <w:p>
+            <w:pPr>
+              <w:jc w:val="center"/>
+            </w:pPr>
+            <w:r/>
+            <w:r>
+              <w:rPr>
+                <w:rFonts w:ascii="Calibri Light" w:hAnsi="Calibri Light"/>
+                <w:b/>
+                <w:color w:val="1B2A4A"/>
+                <w:sz w:val="56"/>
+              </w:rPr>
+              <w:t>{{N}}</w:t>
+            </w:r>
+          </w:p>
+        </w:tc>
+        <w:tc>
+          <w:tcPr>
+            <w:tcW w:type="dxa" w:w="2268"/>
+          </w:tcPr>
+          <w:p>
+            <w:pPr>
+              <w:jc w:val="center"/>
+            </w:pPr>
+            <w:r/>
+            <w:r>
+              <w:rPr>
+                <w:rFonts w:ascii="Calibri Light" w:hAnsi="Calibri Light"/>
+                <w:b/>
+                <w:color w:val="1B2A4A"/>
+                <w:sz w:val="56"/>
+              </w:rPr>
+              <w:t>{{N}}</w:t>
+            </w:r>
+          </w:p>
+        </w:tc>
+      </w:tr>
+      <w:tr>
+        <w:tc>
+          <w:tcPr>
+            <w:tcW w:type="dxa" w:w="2268"/>
+          </w:tcPr>
+          <w:p>
+            <w:pPr>
+              <w:jc w:val="center"/>
+            </w:pPr>
+            <w:r/>
+            <w:r>
+              <w:rPr>
+                <w:rFonts w:ascii="Calibri" w:hAnsi="Calibri"/>
+                <w:color w:val="5A5A65"/>
+                <w:sz w:val="18"/>
+              </w:rPr>
+              <w:t>Total Issues</w:t>
+            </w:r>
+          </w:p>
+        </w:tc>
+        <w:tc>
+          <w:tcPr>
+            <w:tcW w:type="dxa" w:w="2268"/>
+          </w:tcPr>
+          <w:p>
+            <w:pPr>
+              <w:jc w:val="center"/>
+            </w:pPr>
+            <w:r/>
+            <w:r>
+              <w:rPr>
+                <w:rFonts w:ascii="Calibri" w:hAnsi="Calibri"/>
+                <w:color w:val="5A5A65"/>
+                <w:sz w:val="18"/>
+              </w:rPr>
+              <w:t>Open</w:t>
+            </w:r>
+          </w:p>
+        </w:tc>
+        <w:tc>
+          <w:tcPr>
+            <w:tcW w:type="dxa" w:w="2268"/>
+          </w:tcPr>
+          <w:p>
+            <w:pPr>
+              <w:jc w:val="center"/>
+            </w:pPr>
+            <w:r/>
+            <w:r>
+              <w:rPr>
+                <w:rFonts w:ascii="Calibri" w:hAnsi="Calibri"/>
+                <w:color w:val="5A5A65"/>
+                <w:sz w:val="18"/>
+              </w:rPr>
+              <w:t>Resolved</w:t>
+            </w:r>
+          </w:p>
+        </w:tc>
+        <w:tc>
+          <w:tcPr>
+            <w:tcW w:type="dxa" w:w="2268"/>
+          </w:tcPr>
+          <w:p>
+            <w:pPr>
+              <w:jc w:val="center"/>
+            </w:pPr>
+            <w:r/>
+            <w:r>
+              <w:rPr>
+                <w:rFonts w:ascii="Calibri" w:hAnsi="Calibri"/>
+                <w:color w:val="5A5A65"/>
+                <w:sz w:val="18"/>
+              </w:rPr>
+              <w:t>Critical</w:t>
+            </w:r>
+          </w:p>
+        </w:tc>
+      </w:tr>
+    </w:tbl>
+    <w:p>
+      <w:pPr>
+        <w:spacing w:after="160"/>
+      </w:pPr>
+    </w:p>
     <w:p>
       <w:r>
-        <w:t>This document presents the Data Quality Review findings for the {{CUSTOMER}} data migration project. Issues are classified by severity and treatment recommendation.</w:t>
+        <w:t>This document presents the Data Quality Review findings for the {{CUSTOMER}} data migration project. A total of {{N}} issues were identified during source data profiling and validation.</w:t>
       </w:r>
+    </w:p>
+    <w:p>
+      <w:pPr>
+        <w:spacing w:before="160" w:after="160"/>
+        <w:pBdr>
+          <w:left w:val="single" w:sz="24" w:space="8" w:color="C0392B"/>
+        </w:pBdr>
+        <w:shd w:fill="FFEBEE" w:val="clear"/>
+        <w:ind w:left="180" w:right="180"/>
+      </w:pPr>
+      <w:r>
+        <w:rPr>
+          <w:rFonts w:ascii="Calibri" w:hAnsi="Calibri"/>
+          <w:color w:val="33333B"/>
+          <w:sz w:val="20"/>
+        </w:rPr>
+        <w:t>{{N}} critical/blocker issue(s) require resolution before migration can proceed.</w:t>
+      </w:r>
+    </w:p>
+    <w:p>
+      <w:pPr>
+        <w:spacing w:before="240" w:after="240"/>
+        <w:pBdr>
+          <w:bottom w:val="single" w:sz="4" w:space="1" w:color="D0D0D8"/>
+        </w:pBdr>
+      </w:pPr>
     </w:p>
     <w:p>
       <w:pPr>
         <w:pStyle w:val="Heading2"/>
       </w:pPr>
       <w:r>
-        <w:t>Issue Summary</w:t>
+        <w:t>Issue Summary by Severity</w:t>
       </w:r>
     </w:p>
     <w:tbl>
       <w:tblPr>
-        <w:tblStyle w:val="LightGrid-Accent1"/>
         <w:tblW w:type="auto" w:w="0"/>
+        <w:jc w:val="center"/>
         <w:tblLook w:firstColumn="1" w:firstRow="1" w:lastColumn="0" w:lastRow="0" w:noHBand="0" w:noVBand="1" w:val="04A0"/>
+        <w:tblBorders>
+          <w:top w:val="single" w:sz="4" w:space="0" w:color="D0D0D8"/>
+          <w:left w:val="single" w:sz="4" w:space="0" w:color="D0D0D8"/>
+          <w:bottom w:val="single" w:sz="4" w:space="0" w:color="D0D0D8"/>
+          <w:right w:val="single" w:sz="4" w:space="0" w:color="D0D0D8"/>
+          <w:insideH w:val="single" w:sz="2" w:space="0" w:color="E0E0E5"/>
+          <w:insideV w:val="single" w:sz="2" w:space="0" w:color="E0E0E5"/>
+        </w:tblBorders>
       </w:tblPr>
       <w:tblGrid>
-        <w:gridCol w:w="4320"/>
-        <w:gridCol w:w="4320"/>
+        <w:gridCol w:w="2835"/>
+        <w:gridCol w:w="1701"/>
+        <w:gridCol w:w="1701"/>
       </w:tblGrid>
       <w:tr>
         <w:tc>
           <w:tcPr>
-            <w:tcW w:type="dxa" w:w="4320"/>
+            <w:tcW w:type="dxa" w:w="3024"/>
+            <w:shd w:fill="1B2A4A" w:val="clear"/>
           </w:tcPr>
           <w:p>
+            <w:pPr>
+              <w:spacing w:before="80" w:after="80"/>
+            </w:pPr>
+            <w:r/>
             <w:r>
+              <w:rPr>
+                <w:rFonts w:ascii="Calibri" w:hAnsi="Calibri"/>
+                <w:b/>
+                <w:color w:val="FFFFFF"/>
+                <w:sz w:val="19"/>
+              </w:rPr>
               <w:t>Severity</w:t>
             </w:r>
           </w:p>
         </w:tc>
         <w:tc>
           <w:tcPr>
-            <w:tcW w:type="dxa" w:w="4320"/>
+            <w:tcW w:type="dxa" w:w="3024"/>
+            <w:shd w:fill="1B2A4A" w:val="clear"/>
           </w:tcPr>
           <w:p>
+            <w:pPr>
+              <w:spacing w:before="80" w:after="80"/>
+            </w:pPr>
+            <w:r/>
             <w:r>
+              <w:rPr>
+                <w:rFonts w:ascii="Calibri" w:hAnsi="Calibri"/>
+                <w:b/>
+                <w:color w:val="FFFFFF"/>
+                <w:sz w:val="19"/>
+              </w:rPr>
+              <w:t>Count</w:t>
+            </w:r>
+          </w:p>
+        </w:tc>
+        <w:tc>
+          <w:tcPr>
+            <w:tcW w:type="dxa" w:w="3024"/>
+            <w:shd w:fill="1B2A4A" w:val="clear"/>
+          </w:tcPr>
+          <w:p>
+            <w:pPr>
+              <w:spacing w:before="80" w:after="80"/>
+            </w:pPr>
+            <w:r/>
+            <w:r>
+              <w:rPr>
+                <w:rFonts w:ascii="Calibri" w:hAnsi="Calibri"/>
+                <w:b/>
+                <w:color w:val="FFFFFF"/>
+                <w:sz w:val="19"/>
+              </w:rPr>
+              <w:t>Open</w:t>
+            </w:r>
+          </w:p>
+        </w:tc>
+      </w:tr>
+      <w:tr>
+        <w:tc>
+          <w:tcPr>
+            <w:tcW w:type="dxa" w:w="3024"/>
+          </w:tcPr>
+          <w:p>
+            <w:pPr>
+              <w:spacing w:before="60" w:after="60"/>
+            </w:pPr>
+            <w:r/>
+            <w:r>
+              <w:rPr>
+                <w:rFonts w:ascii="Calibri" w:hAnsi="Calibri"/>
+                <w:b/>
+                <w:color w:val="2E5C8A"/>
+                <w:sz w:val="19"/>
+              </w:rPr>
+              <w:t>Critical</w:t>
+            </w:r>
+          </w:p>
+        </w:tc>
+        <w:tc>
+          <w:tcPr>
+            <w:tcW w:type="dxa" w:w="3024"/>
+          </w:tcPr>
+          <w:p>
+            <w:pPr>
+              <w:spacing w:before="60" w:after="60"/>
+            </w:pPr>
+            <w:r/>
+            <w:r>
+              <w:rPr>
+                <w:rFonts w:ascii="Calibri" w:hAnsi="Calibri"/>
+                <w:color w:val="33333B"/>
+                <w:sz w:val="19"/>
+              </w:rPr>
+              <w:t>{{N}}</w:t>
+            </w:r>
+          </w:p>
+        </w:tc>
+        <w:tc>
+          <w:tcPr>
+            <w:tcW w:type="dxa" w:w="3024"/>
+          </w:tcPr>
+          <w:p>
+            <w:pPr>
+              <w:spacing w:before="60" w:after="60"/>
+            </w:pPr>
+            <w:r/>
+            <w:r>
+              <w:rPr>
+                <w:rFonts w:ascii="Calibri" w:hAnsi="Calibri"/>
+                <w:color w:val="33333B"/>
+                <w:sz w:val="19"/>
+              </w:rPr>
+              <w:t>{{N}}</w:t>
+            </w:r>
+          </w:p>
+        </w:tc>
+      </w:tr>
+      <w:tr>
+        <w:tc>
+          <w:tcPr>
+            <w:tcW w:type="dxa" w:w="3024"/>
+            <w:shd w:fill="F5F5F7" w:val="clear"/>
+          </w:tcPr>
+          <w:p>
+            <w:pPr>
+              <w:spacing w:before="60" w:after="60"/>
+            </w:pPr>
+            <w:r/>
+            <w:r>
+              <w:rPr>
+                <w:rFonts w:ascii="Calibri" w:hAnsi="Calibri"/>
+                <w:b/>
+                <w:color w:val="2E5C8A"/>
+                <w:sz w:val="19"/>
+              </w:rPr>
+              <w:t>High</w:t>
+            </w:r>
+          </w:p>
+        </w:tc>
+        <w:tc>
+          <w:tcPr>
+            <w:tcW w:type="dxa" w:w="3024"/>
+            <w:shd w:fill="F5F5F7" w:val="clear"/>
+          </w:tcPr>
+          <w:p>
+            <w:pPr>
+              <w:spacing w:before="60" w:after="60"/>
+            </w:pPr>
+            <w:r/>
+            <w:r>
+              <w:rPr>
+                <w:rFonts w:ascii="Calibri" w:hAnsi="Calibri"/>
+                <w:color w:val="33333B"/>
+                <w:sz w:val="19"/>
+              </w:rPr>
+              <w:t>{{N}}</w:t>
+            </w:r>
+          </w:p>
+        </w:tc>
+        <w:tc>
+          <w:tcPr>
+            <w:tcW w:type="dxa" w:w="3024"/>
+            <w:shd w:fill="F5F5F7" w:val="clear"/>
+          </w:tcPr>
+          <w:p>
+            <w:pPr>
+              <w:spacing w:before="60" w:after="60"/>
+            </w:pPr>
+            <w:r/>
+            <w:r>
+              <w:rPr>
+                <w:rFonts w:ascii="Calibri" w:hAnsi="Calibri"/>
+                <w:color w:val="33333B"/>
+                <w:sz w:val="19"/>
+              </w:rPr>
+              <w:t>{{N}}</w:t>
+            </w:r>
+          </w:p>
+        </w:tc>
+      </w:tr>
+      <w:tr>
+        <w:tc>
+          <w:tcPr>
+            <w:tcW w:type="dxa" w:w="3024"/>
+          </w:tcPr>
+          <w:p>
+            <w:pPr>
+              <w:spacing w:before="60" w:after="60"/>
+            </w:pPr>
+            <w:r/>
+            <w:r>
+              <w:rPr>
+                <w:rFonts w:ascii="Calibri" w:hAnsi="Calibri"/>
+                <w:b/>
+                <w:color w:val="2E5C8A"/>
+                <w:sz w:val="19"/>
+              </w:rPr>
+              <w:t>Medium</w:t>
+            </w:r>
+          </w:p>
+        </w:tc>
+        <w:tc>
+          <w:tcPr>
+            <w:tcW w:type="dxa" w:w="3024"/>
+          </w:tcPr>
+          <w:p>
+            <w:pPr>
+              <w:spacing w:before="60" w:after="60"/>
+            </w:pPr>
+            <w:r/>
+            <w:r>
+              <w:rPr>
+                <w:rFonts w:ascii="Calibri" w:hAnsi="Calibri"/>
+                <w:color w:val="33333B"/>
+                <w:sz w:val="19"/>
+              </w:rPr>
+              <w:t>{{N}}</w:t>
+            </w:r>
+          </w:p>
+        </w:tc>
+        <w:tc>
+          <w:tcPr>
+            <w:tcW w:type="dxa" w:w="3024"/>
+          </w:tcPr>
+          <w:p>
+            <w:pPr>
+              <w:spacing w:before="60" w:after="60"/>
+            </w:pPr>
+            <w:r/>
+            <w:r>
+              <w:rPr>
+                <w:rFonts w:ascii="Calibri" w:hAnsi="Calibri"/>
+                <w:color w:val="33333B"/>
+                <w:sz w:val="19"/>
+              </w:rPr>
+              <w:t>{{N}}</w:t>
+            </w:r>
+          </w:p>
+        </w:tc>
+      </w:tr>
+      <w:tr>
+        <w:tc>
+          <w:tcPr>
+            <w:tcW w:type="dxa" w:w="3024"/>
+            <w:shd w:fill="F5F5F7" w:val="clear"/>
+          </w:tcPr>
+          <w:p>
+            <w:pPr>
+              <w:spacing w:before="60" w:after="60"/>
+            </w:pPr>
+            <w:r/>
+            <w:r>
+              <w:rPr>
+                <w:rFonts w:ascii="Calibri" w:hAnsi="Calibri"/>
+                <w:b/>
+                <w:color w:val="2E5C8A"/>
+                <w:sz w:val="19"/>
+              </w:rPr>
+              <w:t>Low</w:t>
+            </w:r>
+          </w:p>
+        </w:tc>
+        <w:tc>
+          <w:tcPr>
+            <w:tcW w:type="dxa" w:w="3024"/>
+            <w:shd w:fill="F5F5F7" w:val="clear"/>
+          </w:tcPr>
+          <w:p>
+            <w:pPr>
+              <w:spacing w:before="60" w:after="60"/>
+            </w:pPr>
+            <w:r/>
+            <w:r>
+              <w:rPr>
+                <w:rFonts w:ascii="Calibri" w:hAnsi="Calibri"/>
+                <w:color w:val="33333B"/>
+                <w:sz w:val="19"/>
+              </w:rPr>
+              <w:t>{{N}}</w:t>
+            </w:r>
+          </w:p>
+        </w:tc>
+        <w:tc>
+          <w:tcPr>
+            <w:tcW w:type="dxa" w:w="3024"/>
+            <w:shd w:fill="F5F5F7" w:val="clear"/>
+          </w:tcPr>
+          <w:p>
+            <w:pPr>
+              <w:spacing w:before="60" w:after="60"/>
+            </w:pPr>
+            <w:r/>
+            <w:r>
+              <w:rPr>
+                <w:rFonts w:ascii="Calibri" w:hAnsi="Calibri"/>
+                <w:color w:val="33333B"/>
+                <w:sz w:val="19"/>
+              </w:rPr>
+              <w:t>{{N}}</w:t>
+            </w:r>
+          </w:p>
+        </w:tc>
+      </w:tr>
+      <w:tr>
+        <w:tc>
+          <w:tcPr>
+            <w:tcW w:type="dxa" w:w="3024"/>
+          </w:tcPr>
+          <w:p>
+            <w:pPr>
+              <w:spacing w:before="60" w:after="60"/>
+            </w:pPr>
+            <w:r/>
+            <w:r>
+              <w:rPr>
+                <w:rFonts w:ascii="Calibri" w:hAnsi="Calibri"/>
+                <w:b/>
+                <w:color w:val="2E5C8A"/>
+                <w:sz w:val="19"/>
+              </w:rPr>
+              <w:t>Info</w:t>
+            </w:r>
+          </w:p>
+        </w:tc>
+        <w:tc>
+          <w:tcPr>
+            <w:tcW w:type="dxa" w:w="3024"/>
+          </w:tcPr>
+          <w:p>
+            <w:pPr>
+              <w:spacing w:before="60" w:after="60"/>
+            </w:pPr>
+            <w:r/>
+            <w:r>
+              <w:rPr>
+                <w:rFonts w:ascii="Calibri" w:hAnsi="Calibri"/>
+                <w:color w:val="33333B"/>
+                <w:sz w:val="19"/>
+              </w:rPr>
+              <w:t>{{N}}</w:t>
+            </w:r>
+          </w:p>
+        </w:tc>
+        <w:tc>
+          <w:tcPr>
+            <w:tcW w:type="dxa" w:w="3024"/>
+          </w:tcPr>
+          <w:p>
+            <w:pPr>
+              <w:spacing w:before="60" w:after="60"/>
+            </w:pPr>
+            <w:r/>
+            <w:r>
+              <w:rPr>
+                <w:rFonts w:ascii="Calibri" w:hAnsi="Calibri"/>
+                <w:color w:val="33333B"/>
+                <w:sz w:val="19"/>
+              </w:rPr>
+              <w:t>{{N}}</w:t>
+            </w:r>
+          </w:p>
+        </w:tc>
+      </w:tr>
+    </w:tbl>
+    <w:p>
+      <w:pPr>
+        <w:spacing w:after="120"/>
+      </w:pPr>
+    </w:p>
+    <w:p>
+      <w:pPr>
+        <w:pStyle w:val="Heading2"/>
+      </w:pPr>
+      <w:r>
+        <w:t>Issue Summary by Treatment</w:t>
+      </w:r>
+    </w:p>
+    <w:tbl>
+      <w:tblPr>
+        <w:tblW w:type="auto" w:w="0"/>
+        <w:jc w:val="center"/>
+        <w:tblLook w:firstColumn="1" w:firstRow="1" w:lastColumn="0" w:lastRow="0" w:noHBand="0" w:noVBand="1" w:val="04A0"/>
+        <w:tblBorders>
+          <w:top w:val="single" w:sz="4" w:space="0" w:color="D0D0D8"/>
+          <w:left w:val="single" w:sz="4" w:space="0" w:color="D0D0D8"/>
+          <w:bottom w:val="single" w:sz="4" w:space="0" w:color="D0D0D8"/>
+          <w:right w:val="single" w:sz="4" w:space="0" w:color="D0D0D8"/>
+          <w:insideH w:val="single" w:sz="2" w:space="0" w:color="E0E0E5"/>
+          <w:insideV w:val="single" w:sz="2" w:space="0" w:color="E0E0E5"/>
+        </w:tblBorders>
+      </w:tblPr>
+      <w:tblGrid>
+        <w:gridCol w:w="4535"/>
+        <w:gridCol w:w="1701"/>
+      </w:tblGrid>
+      <w:tr>
+        <w:tc>
+          <w:tcPr>
+            <w:tcW w:type="dxa" w:w="4536"/>
+            <w:shd w:fill="1B2A4A" w:val="clear"/>
+          </w:tcPr>
+          <w:p>
+            <w:pPr>
+              <w:spacing w:before="80" w:after="80"/>
+            </w:pPr>
+            <w:r/>
+            <w:r>
+              <w:rPr>
+                <w:rFonts w:ascii="Calibri" w:hAnsi="Calibri"/>
+                <w:b/>
+                <w:color w:val="FFFFFF"/>
+                <w:sz w:val="19"/>
+              </w:rPr>
+              <w:t>Treatment</w:t>
+            </w:r>
+          </w:p>
+        </w:tc>
+        <w:tc>
+          <w:tcPr>
+            <w:tcW w:type="dxa" w:w="4536"/>
+            <w:shd w:fill="1B2A4A" w:val="clear"/>
+          </w:tcPr>
+          <w:p>
+            <w:pPr>
+              <w:spacing w:before="80" w:after="80"/>
+            </w:pPr>
+            <w:r/>
+            <w:r>
+              <w:rPr>
+                <w:rFonts w:ascii="Calibri" w:hAnsi="Calibri"/>
+                <w:b/>
+                <w:color w:val="FFFFFF"/>
+                <w:sz w:val="19"/>
+              </w:rPr>
               <w:t>Count</w:t>
             </w:r>
           </w:p>
@@ -126,21 +824,39 @@
       <w:tr>
         <w:tc>
           <w:tcPr>
-            <w:tcW w:type="dxa" w:w="4320"/>
+            <w:tcW w:type="dxa" w:w="4536"/>
           </w:tcPr>
           <w:p>
+            <w:pPr>
+              <w:spacing w:before="60" w:after="60"/>
+            </w:pPr>
+            <w:r/>
             <w:r>
-              <w:t>Blocker</w:t>
+              <w:rPr>
+                <w:rFonts w:ascii="Calibri" w:hAnsi="Calibri"/>
+                <w:color w:val="33333B"/>
+                <w:sz w:val="19"/>
+              </w:rPr>
+              <w:t>Accept Ignore</w:t>
             </w:r>
           </w:p>
         </w:tc>
         <w:tc>
           <w:tcPr>
-            <w:tcW w:type="dxa" w:w="4320"/>
+            <w:tcW w:type="dxa" w:w="4536"/>
           </w:tcPr>
           <w:p>
+            <w:pPr>
+              <w:spacing w:before="60" w:after="60"/>
+            </w:pPr>
+            <w:r/>
             <w:r>
-              <w:t>{{COUNT_BLOCKER}}</w:t>
+              <w:rPr>
+                <w:rFonts w:ascii="Calibri" w:hAnsi="Calibri"/>
+                <w:color w:val="33333B"/>
+                <w:sz w:val="19"/>
+              </w:rPr>
+              <w:t>{{N}}</w:t>
             </w:r>
           </w:p>
         </w:tc>
@@ -148,21 +864,41 @@
       <w:tr>
         <w:tc>
           <w:tcPr>
-            <w:tcW w:type="dxa" w:w="4320"/>
+            <w:tcW w:type="dxa" w:w="4536"/>
+            <w:shd w:fill="F5F5F7" w:val="clear"/>
           </w:tcPr>
           <w:p>
+            <w:pPr>
+              <w:spacing w:before="60" w:after="60"/>
+            </w:pPr>
+            <w:r/>
             <w:r>
-              <w:t>High</w:t>
+              <w:rPr>
+                <w:rFonts w:ascii="Calibri" w:hAnsi="Calibri"/>
+                <w:color w:val="33333B"/>
+                <w:sz w:val="19"/>
+              </w:rPr>
+              <w:t>Fix In Flight</w:t>
             </w:r>
           </w:p>
         </w:tc>
         <w:tc>
           <w:tcPr>
-            <w:tcW w:type="dxa" w:w="4320"/>
+            <w:tcW w:type="dxa" w:w="4536"/>
+            <w:shd w:fill="F5F5F7" w:val="clear"/>
           </w:tcPr>
           <w:p>
+            <w:pPr>
+              <w:spacing w:before="60" w:after="60"/>
+            </w:pPr>
+            <w:r/>
             <w:r>
-              <w:t>{{COUNT_HIGH}}</w:t>
+              <w:rPr>
+                <w:rFonts w:ascii="Calibri" w:hAnsi="Calibri"/>
+                <w:color w:val="33333B"/>
+                <w:sz w:val="19"/>
+              </w:rPr>
+              <w:t>{{N}}</w:t>
             </w:r>
           </w:p>
         </w:tc>
@@ -170,70 +906,49 @@
       <w:tr>
         <w:tc>
           <w:tcPr>
-            <w:tcW w:type="dxa" w:w="4320"/>
+            <w:tcW w:type="dxa" w:w="4536"/>
           </w:tcPr>
           <w:p>
+            <w:pPr>
+              <w:spacing w:before="60" w:after="60"/>
+            </w:pPr>
+            <w:r/>
             <w:r>
-              <w:t>Medium</w:t>
+              <w:rPr>
+                <w:rFonts w:ascii="Calibri" w:hAnsi="Calibri"/>
+                <w:color w:val="33333B"/>
+                <w:sz w:val="19"/>
+              </w:rPr>
+              <w:t>Needs Decision</w:t>
             </w:r>
           </w:p>
         </w:tc>
         <w:tc>
           <w:tcPr>
-            <w:tcW w:type="dxa" w:w="4320"/>
+            <w:tcW w:type="dxa" w:w="4536"/>
           </w:tcPr>
           <w:p>
+            <w:pPr>
+              <w:spacing w:before="60" w:after="60"/>
+            </w:pPr>
+            <w:r/>
             <w:r>
-              <w:t>{{COUNT_MEDIUM}}</w:t>
-            </w:r>
-          </w:p>
-        </w:tc>
-      </w:tr>
-      <w:tr>
-        <w:tc>
-          <w:tcPr>
-            <w:tcW w:type="dxa" w:w="4320"/>
-          </w:tcPr>
-          <w:p>
-            <w:r>
-              <w:t>Low</w:t>
-            </w:r>
-          </w:p>
-        </w:tc>
-        <w:tc>
-          <w:tcPr>
-            <w:tcW w:type="dxa" w:w="4320"/>
-          </w:tcPr>
-          <w:p>
-            <w:r>
-              <w:t>{{COUNT_LOW}}</w:t>
-            </w:r>
-          </w:p>
-        </w:tc>
-      </w:tr>
-      <w:tr>
-        <w:tc>
-          <w:tcPr>
-            <w:tcW w:type="dxa" w:w="4320"/>
-          </w:tcPr>
-          <w:p>
-            <w:r>
-              <w:t>Info</w:t>
-            </w:r>
-          </w:p>
-        </w:tc>
-        <w:tc>
-          <w:tcPr>
-            <w:tcW w:type="dxa" w:w="4320"/>
-          </w:tcPr>
-          <w:p>
-            <w:r>
-              <w:t>{{COUNT_INFO}}</w:t>
+              <w:rPr>
+                <w:rFonts w:ascii="Calibri" w:hAnsi="Calibri"/>
+                <w:color w:val="33333B"/>
+                <w:sz w:val="19"/>
+              </w:rPr>
+              <w:t>{{N}}</w:t>
             </w:r>
           </w:p>
         </w:tc>
       </w:tr>
     </w:tbl>
+    <w:p>
+      <w:pPr>
+        <w:spacing w:after="120"/>
+      </w:pPr>
+    </w:p>
     <w:p>
       <w:r>
         <w:br w:type="page"/>
@@ -249,6 +964,9 @@
     </w:p>
     <w:p>
       <w:r>
+        <w:rPr>
+          <w:color w:val="5A5A65"/>
+        </w:rPr>
         <w:t>Each issue is documented with its source, impact, and recommended treatment.</w:t>
       </w:r>
     </w:p>
@@ -257,37 +975,77 @@
         <w:pStyle w:val="Heading2"/>
       </w:pPr>
       <w:r>
-        <w:t>{{ISSUE_ID}} — {{ISSUE_CHECK}}</w:t>
+        <w:rPr>
+          <w:color w:val="E67E22"/>
+        </w:rPr>
+        <w:t>{{DQI-001}} — {{Issue description}}</w:t>
+      </w:r>
+      <w:r>
+        <w:rPr>
+          <w:rFonts w:ascii="Calibri" w:hAnsi="Calibri"/>
+          <w:b/>
+          <w:color w:val="E67E22"/>
+          <w:sz w:val="18"/>
+        </w:rPr>
+        <w:t xml:space="preserve">  [HIGH]</w:t>
       </w:r>
     </w:p>
     <w:tbl>
       <w:tblPr>
-        <w:tblStyle w:val="LightGrid-Accent1"/>
         <w:tblW w:type="auto" w:w="0"/>
+        <w:jc w:val="left"/>
         <w:tblLook w:firstColumn="1" w:firstRow="1" w:lastColumn="0" w:lastRow="0" w:noHBand="0" w:noVBand="1" w:val="04A0"/>
+        <w:tblBorders>
+          <w:top w:val="single" w:sz="4" w:space="0" w:color="D0D0D8"/>
+          <w:left w:val="single" w:sz="4" w:space="0" w:color="D0D0D8"/>
+          <w:bottom w:val="single" w:sz="4" w:space="0" w:color="D0D0D8"/>
+          <w:right w:val="single" w:sz="4" w:space="0" w:color="D0D0D8"/>
+          <w:insideH w:val="single" w:sz="2" w:space="0" w:color="E0E0E5"/>
+          <w:insideV w:val="single" w:sz="2" w:space="0" w:color="E0E0E5"/>
+        </w:tblBorders>
       </w:tblPr>
       <w:tblGrid>
-        <w:gridCol w:w="4320"/>
-        <w:gridCol w:w="4320"/>
+        <w:gridCol w:w="2268"/>
+        <w:gridCol w:w="6803"/>
       </w:tblGrid>
       <w:tr>
         <w:tc>
           <w:tcPr>
-            <w:tcW w:type="dxa" w:w="4320"/>
+            <w:tcW w:type="dxa" w:w="4536"/>
+            <w:shd w:fill="E8F1F8" w:val="clear"/>
           </w:tcPr>
           <w:p>
+            <w:pPr>
+              <w:spacing w:before="60" w:after="60"/>
+            </w:pPr>
+            <w:r/>
             <w:r>
+              <w:rPr>
+                <w:rFonts w:ascii="Calibri" w:hAnsi="Calibri"/>
+                <w:b/>
+                <w:color w:val="5A5A65"/>
+                <w:sz w:val="19"/>
+              </w:rPr>
               <w:t>Category</w:t>
             </w:r>
           </w:p>
         </w:tc>
         <w:tc>
           <w:tcPr>
-            <w:tcW w:type="dxa" w:w="4320"/>
+            <w:tcW w:type="dxa" w:w="4536"/>
           </w:tcPr>
           <w:p>
+            <w:pPr>
+              <w:spacing w:before="60" w:after="60"/>
+            </w:pPr>
+            <w:r/>
             <w:r>
-              <w:t>{{CATEGORY}}</w:t>
+              <w:rPr>
+                <w:rFonts w:ascii="Calibri" w:hAnsi="Calibri"/>
+                <w:color w:val="33333B"/>
+                <w:sz w:val="19"/>
+              </w:rPr>
+              <w:t>{{coded_values}}</w:t>
             </w:r>
           </w:p>
         </w:tc>
@@ -295,21 +1053,42 @@
       <w:tr>
         <w:tc>
           <w:tcPr>
-            <w:tcW w:type="dxa" w:w="4320"/>
+            <w:tcW w:type="dxa" w:w="4536"/>
+            <w:shd w:fill="E8F1F8" w:val="clear"/>
           </w:tcPr>
           <w:p>
+            <w:pPr>
+              <w:spacing w:before="60" w:after="60"/>
+            </w:pPr>
+            <w:r/>
             <w:r>
+              <w:rPr>
+                <w:rFonts w:ascii="Calibri" w:hAnsi="Calibri"/>
+                <w:b/>
+                <w:color w:val="5A5A65"/>
+                <w:sz w:val="19"/>
+              </w:rPr>
               <w:t>Source Object</w:t>
             </w:r>
           </w:p>
         </w:tc>
         <w:tc>
           <w:tcPr>
-            <w:tcW w:type="dxa" w:w="4320"/>
+            <w:tcW w:type="dxa" w:w="4536"/>
+            <w:shd w:fill="F5F5F7" w:val="clear"/>
           </w:tcPr>
           <w:p>
+            <w:pPr>
+              <w:spacing w:before="60" w:after="60"/>
+            </w:pPr>
+            <w:r/>
             <w:r>
-              <w:t>{{SOURCE_OBJECT}}</w:t>
+              <w:rPr>
+                <w:rFonts w:ascii="Calibri" w:hAnsi="Calibri"/>
+                <w:color w:val="33333B"/>
+                <w:sz w:val="19"/>
+              </w:rPr>
+              <w:t>{{LAYER_NAME}}</w:t>
             </w:r>
           </w:p>
         </w:tc>
@@ -317,21 +1096,41 @@
       <w:tr>
         <w:tc>
           <w:tcPr>
-            <w:tcW w:type="dxa" w:w="4320"/>
+            <w:tcW w:type="dxa" w:w="4536"/>
+            <w:shd w:fill="E8F1F8" w:val="clear"/>
           </w:tcPr>
           <w:p>
+            <w:pPr>
+              <w:spacing w:before="60" w:after="60"/>
+            </w:pPr>
+            <w:r/>
             <w:r>
+              <w:rPr>
+                <w:rFonts w:ascii="Calibri" w:hAnsi="Calibri"/>
+                <w:b/>
+                <w:color w:val="5A5A65"/>
+                <w:sz w:val="19"/>
+              </w:rPr>
               <w:t>Source Attribute</w:t>
             </w:r>
           </w:p>
         </w:tc>
         <w:tc>
           <w:tcPr>
-            <w:tcW w:type="dxa" w:w="4320"/>
+            <w:tcW w:type="dxa" w:w="4536"/>
           </w:tcPr>
           <w:p>
+            <w:pPr>
+              <w:spacing w:before="60" w:after="60"/>
+            </w:pPr>
+            <w:r/>
             <w:r>
-              <w:t>{{SOURCE_ATTRIBUTE}}</w:t>
+              <w:rPr>
+                <w:rFonts w:ascii="Calibri" w:hAnsi="Calibri"/>
+                <w:color w:val="33333B"/>
+                <w:sz w:val="19"/>
+              </w:rPr>
+              <w:t>{{ATTRIBUTE_NAME}}</w:t>
             </w:r>
           </w:p>
         </w:tc>
@@ -339,21 +1138,42 @@
       <w:tr>
         <w:tc>
           <w:tcPr>
-            <w:tcW w:type="dxa" w:w="4320"/>
+            <w:tcW w:type="dxa" w:w="4536"/>
+            <w:shd w:fill="E8F1F8" w:val="clear"/>
           </w:tcPr>
           <w:p>
+            <w:pPr>
+              <w:spacing w:before="60" w:after="60"/>
+            </w:pPr>
+            <w:r/>
             <w:r>
+              <w:rPr>
+                <w:rFonts w:ascii="Calibri" w:hAnsi="Calibri"/>
+                <w:b/>
+                <w:color w:val="5A5A65"/>
+                <w:sz w:val="19"/>
+              </w:rPr>
               <w:t>Severity</w:t>
             </w:r>
           </w:p>
         </w:tc>
         <w:tc>
           <w:tcPr>
-            <w:tcW w:type="dxa" w:w="4320"/>
+            <w:tcW w:type="dxa" w:w="4536"/>
+            <w:shd w:fill="F5F5F7" w:val="clear"/>
           </w:tcPr>
           <w:p>
+            <w:pPr>
+              <w:spacing w:before="60" w:after="60"/>
+            </w:pPr>
+            <w:r/>
             <w:r>
-              <w:t>{{SEVERITY}}</w:t>
+              <w:rPr>
+                <w:rFonts w:ascii="Calibri" w:hAnsi="Calibri"/>
+                <w:color w:val="33333B"/>
+                <w:sz w:val="19"/>
+              </w:rPr>
+              <w:t>{{High}}</w:t>
             </w:r>
           </w:p>
         </w:tc>
@@ -361,21 +1181,41 @@
       <w:tr>
         <w:tc>
           <w:tcPr>
-            <w:tcW w:type="dxa" w:w="4320"/>
+            <w:tcW w:type="dxa" w:w="4536"/>
+            <w:shd w:fill="E8F1F8" w:val="clear"/>
           </w:tcPr>
           <w:p>
+            <w:pPr>
+              <w:spacing w:before="60" w:after="60"/>
+            </w:pPr>
+            <w:r/>
             <w:r>
+              <w:rPr>
+                <w:rFonts w:ascii="Calibri" w:hAnsi="Calibri"/>
+                <w:b/>
+                <w:color w:val="5A5A65"/>
+                <w:sz w:val="19"/>
+              </w:rPr>
               <w:t>Affected Count</w:t>
             </w:r>
           </w:p>
         </w:tc>
         <w:tc>
           <w:tcPr>
-            <w:tcW w:type="dxa" w:w="4320"/>
+            <w:tcW w:type="dxa" w:w="4536"/>
           </w:tcPr>
           <w:p>
+            <w:pPr>
+              <w:spacing w:before="60" w:after="60"/>
+            </w:pPr>
+            <w:r/>
             <w:r>
-              <w:t>{{AFFECTED_COUNT}}</w:t>
+              <w:rPr>
+                <w:rFonts w:ascii="Calibri" w:hAnsi="Calibri"/>
+                <w:color w:val="33333B"/>
+                <w:sz w:val="19"/>
+              </w:rPr>
+              <w:t>{{N}}</w:t>
             </w:r>
           </w:p>
         </w:tc>
@@ -383,21 +1223,42 @@
       <w:tr>
         <w:tc>
           <w:tcPr>
-            <w:tcW w:type="dxa" w:w="4320"/>
+            <w:tcW w:type="dxa" w:w="4536"/>
+            <w:shd w:fill="E8F1F8" w:val="clear"/>
           </w:tcPr>
           <w:p>
+            <w:pPr>
+              <w:spacing w:before="60" w:after="60"/>
+            </w:pPr>
+            <w:r/>
             <w:r>
+              <w:rPr>
+                <w:rFonts w:ascii="Calibri" w:hAnsi="Calibri"/>
+                <w:b/>
+                <w:color w:val="5A5A65"/>
+                <w:sz w:val="19"/>
+              </w:rPr>
               <w:t>Affected %</w:t>
             </w:r>
           </w:p>
         </w:tc>
         <w:tc>
           <w:tcPr>
-            <w:tcW w:type="dxa" w:w="4320"/>
+            <w:tcW w:type="dxa" w:w="4536"/>
+            <w:shd w:fill="F5F5F7" w:val="clear"/>
           </w:tcPr>
           <w:p>
+            <w:pPr>
+              <w:spacing w:before="60" w:after="60"/>
+            </w:pPr>
+            <w:r/>
             <w:r>
-              <w:t>{{AFFECTED_PERCENT}}</w:t>
+              <w:rPr>
+                <w:rFonts w:ascii="Calibri" w:hAnsi="Calibri"/>
+                <w:color w:val="33333B"/>
+                <w:sz w:val="19"/>
+              </w:rPr>
+              <w:t>{{N}}%</w:t>
             </w:r>
           </w:p>
         </w:tc>
@@ -405,21 +1266,41 @@
       <w:tr>
         <w:tc>
           <w:tcPr>
-            <w:tcW w:type="dxa" w:w="4320"/>
+            <w:tcW w:type="dxa" w:w="4536"/>
+            <w:shd w:fill="E8F1F8" w:val="clear"/>
           </w:tcPr>
           <w:p>
+            <w:pPr>
+              <w:spacing w:before="60" w:after="60"/>
+            </w:pPr>
+            <w:r/>
             <w:r>
+              <w:rPr>
+                <w:rFonts w:ascii="Calibri" w:hAnsi="Calibri"/>
+                <w:b/>
+                <w:color w:val="5A5A65"/>
+                <w:sz w:val="19"/>
+              </w:rPr>
               <w:t>Examples</w:t>
             </w:r>
           </w:p>
         </w:tc>
         <w:tc>
           <w:tcPr>
-            <w:tcW w:type="dxa" w:w="4320"/>
+            <w:tcW w:type="dxa" w:w="4536"/>
           </w:tcPr>
           <w:p>
+            <w:pPr>
+              <w:spacing w:before="60" w:after="60"/>
+            </w:pPr>
+            <w:r/>
             <w:r>
-              <w:t>{{EXAMPLES}}</w:t>
+              <w:rPr>
+                <w:rFonts w:ascii="Calibri" w:hAnsi="Calibri"/>
+                <w:color w:val="33333B"/>
+                <w:sz w:val="19"/>
+              </w:rPr>
+              <w:t>{{val1, val2, val3}}</w:t>
             </w:r>
           </w:p>
         </w:tc>
@@ -427,21 +1308,42 @@
       <w:tr>
         <w:tc>
           <w:tcPr>
-            <w:tcW w:type="dxa" w:w="4320"/>
+            <w:tcW w:type="dxa" w:w="4536"/>
+            <w:shd w:fill="E8F1F8" w:val="clear"/>
           </w:tcPr>
           <w:p>
+            <w:pPr>
+              <w:spacing w:before="60" w:after="60"/>
+            </w:pPr>
+            <w:r/>
             <w:r>
+              <w:rPr>
+                <w:rFonts w:ascii="Calibri" w:hAnsi="Calibri"/>
+                <w:b/>
+                <w:color w:val="5A5A65"/>
+                <w:sz w:val="19"/>
+              </w:rPr>
               <w:t>Treatment</w:t>
             </w:r>
           </w:p>
         </w:tc>
         <w:tc>
           <w:tcPr>
-            <w:tcW w:type="dxa" w:w="4320"/>
+            <w:tcW w:type="dxa" w:w="4536"/>
+            <w:shd w:fill="F5F5F7" w:val="clear"/>
           </w:tcPr>
           <w:p>
+            <w:pPr>
+              <w:spacing w:before="60" w:after="60"/>
+            </w:pPr>
+            <w:r/>
             <w:r>
-              <w:t>{{TREATMENT}}</w:t>
+              <w:rPr>
+                <w:rFonts w:ascii="Calibri" w:hAnsi="Calibri"/>
+                <w:color w:val="33333B"/>
+                <w:sz w:val="19"/>
+              </w:rPr>
+              <w:t>{{Fix In Flight}}</w:t>
             </w:r>
           </w:p>
         </w:tc>
@@ -449,21 +1351,41 @@
       <w:tr>
         <w:tc>
           <w:tcPr>
-            <w:tcW w:type="dxa" w:w="4320"/>
+            <w:tcW w:type="dxa" w:w="4536"/>
+            <w:shd w:fill="E8F1F8" w:val="clear"/>
           </w:tcPr>
           <w:p>
+            <w:pPr>
+              <w:spacing w:before="60" w:after="60"/>
+            </w:pPr>
+            <w:r/>
             <w:r>
+              <w:rPr>
+                <w:rFonts w:ascii="Calibri" w:hAnsi="Calibri"/>
+                <w:b/>
+                <w:color w:val="5A5A65"/>
+                <w:sz w:val="19"/>
+              </w:rPr>
               <w:t>Status</w:t>
             </w:r>
           </w:p>
         </w:tc>
         <w:tc>
           <w:tcPr>
-            <w:tcW w:type="dxa" w:w="4320"/>
+            <w:tcW w:type="dxa" w:w="4536"/>
           </w:tcPr>
           <w:p>
+            <w:pPr>
+              <w:spacing w:before="60" w:after="60"/>
+            </w:pPr>
+            <w:r/>
             <w:r>
-              <w:t>{{STATUS}}</w:t>
+              <w:rPr>
+                <w:rFonts w:ascii="Calibri" w:hAnsi="Calibri"/>
+                <w:color w:val="33333B"/>
+                <w:sz w:val="19"/>
+              </w:rPr>
+              <w:t>{{Open}}</w:t>
             </w:r>
           </w:p>
         </w:tc>
@@ -471,40 +1393,183 @@
       <w:tr>
         <w:tc>
           <w:tcPr>
-            <w:tcW w:type="dxa" w:w="4320"/>
+            <w:tcW w:type="dxa" w:w="4536"/>
+            <w:shd w:fill="E8F1F8" w:val="clear"/>
           </w:tcPr>
           <w:p>
+            <w:pPr>
+              <w:spacing w:before="60" w:after="60"/>
+            </w:pPr>
+            <w:r/>
             <w:r>
+              <w:rPr>
+                <w:rFonts w:ascii="Calibri" w:hAnsi="Calibri"/>
+                <w:b/>
+                <w:color w:val="5A5A65"/>
+                <w:sz w:val="19"/>
+              </w:rPr>
               <w:t>Owner</w:t>
             </w:r>
           </w:p>
         </w:tc>
         <w:tc>
           <w:tcPr>
-            <w:tcW w:type="dxa" w:w="4320"/>
+            <w:tcW w:type="dxa" w:w="4536"/>
+            <w:shd w:fill="F5F5F7" w:val="clear"/>
           </w:tcPr>
           <w:p>
+            <w:pPr>
+              <w:spacing w:before="60" w:after="60"/>
+            </w:pPr>
+            <w:r/>
             <w:r>
-              <w:t>{{OWNER}}</w:t>
+              <w:rPr>
+                <w:rFonts w:ascii="Calibri" w:hAnsi="Calibri"/>
+                <w:color w:val="33333B"/>
+                <w:sz w:val="19"/>
+              </w:rPr>
+              <w:t>{{migration_engineer}}</w:t>
             </w:r>
           </w:p>
         </w:tc>
       </w:tr>
     </w:tbl>
-    <w:p/>
     <w:p>
+      <w:pPr>
+        <w:spacing w:after="80"/>
+      </w:pPr>
+    </w:p>
+    <w:p>
+      <w:pPr>
+        <w:spacing w:before="160" w:after="160"/>
+        <w:pBdr>
+          <w:left w:val="single" w:sz="24" w:space="8" w:color="E67E22"/>
+        </w:pBdr>
+        <w:shd w:fill="FFF3E0" w:val="clear"/>
+        <w:ind w:left="180" w:right="180"/>
+      </w:pPr>
       <w:r>
-        <w:t>Impact if unresolved: {{IMPACT_IF_UNRESOLVED}}</w:t>
+        <w:rPr>
+          <w:rFonts w:ascii="Calibri" w:hAnsi="Calibri"/>
+          <w:color w:val="33333B"/>
+          <w:sz w:val="20"/>
+        </w:rPr>
+        <w:t>Impact if unresolved: {{description of downstream consequences}}</w:t>
+      </w:r>
+    </w:p>
+    <w:p>
+      <w:pPr>
+        <w:spacing w:before="160" w:after="160"/>
+        <w:pBdr>
+          <w:left w:val="single" w:sz="24" w:space="8" w:color="27AE60"/>
+        </w:pBdr>
+        <w:shd w:fill="E8F5E9" w:val="clear"/>
+        <w:ind w:left="180" w:right="180"/>
+      </w:pPr>
+      <w:r>
+        <w:rPr>
+          <w:rFonts w:ascii="Calibri" w:hAnsi="Calibri"/>
+          <w:color w:val="33333B"/>
+          <w:sz w:val="20"/>
+        </w:rPr>
+        <w:t>Resolution: {{description of fix applied}}</w:t>
       </w:r>
     </w:p>
     <w:sectPr>
-      <w:pgSz w:w="12240" w:h="15840"/>
-      <w:pgMar w:top="1440" w:right="1800" w:bottom="1440" w:left="1800" w:header="720" w:footer="720" w:gutter="0"/>
+      <w:headerReference w:type="default" r:id="rId9"/>
+      <w:footerReference w:type="default" r:id="rId10"/>
+      <w:pgSz w:w="11906" w:h="16838"/>
+      <w:pgMar w:top="1417" w:right="1417" w:bottom="1134" w:left="1417" w:header="720" w:footer="720" w:gutter="0"/>
       <w:cols w:space="720"/>
       <w:docGrid w:linePitch="360"/>
     </w:sectPr>
   </w:body>
 </w:document>
+</file>
+
+<file path=word/footer1.xml><?xml version="1.0" encoding="utf-8"?>
+<w:ftr xmlns:m="http://schemas.openxmlformats.org/officeDocument/2006/math" xmlns:mc="http://schemas.openxmlformats.org/markup-compatibility/2006" xmlns:mo="http://schemas.microsoft.com/office/mac/office/2008/main" xmlns:mv="urn:schemas-microsoft-com:mac:vml" xmlns:o="urn:schemas-microsoft-com:office:office" xmlns:r="http://schemas.openxmlformats.org/officeDocument/2006/relationships" xmlns:v="urn:schemas-microsoft-com:vml" xmlns:w10="urn:schemas-microsoft-com:office:word" xmlns:w14="http://schemas.microsoft.com/office/word/2010/wordml" xmlns:w="http://schemas.openxmlformats.org/wordprocessingml/2006/main" xmlns:wne="http://schemas.microsoft.com/office/word/2006/wordml" xmlns:wp14="http://schemas.microsoft.com/office/word/2010/wordprocessingDrawing" xmlns:wp="http://schemas.openxmlformats.org/drawingml/2006/wordprocessingDrawing" xmlns:wpc="http://schemas.microsoft.com/office/word/2010/wordprocessingCanvas" xmlns:wpg="http://schemas.microsoft.com/office/word/2010/wordprocessingGroup" xmlns:wpi="http://schemas.microsoft.com/office/word/2010/wordprocessingInk" xmlns:wps="http://schemas.microsoft.com/office/word/2010/wordprocessingShape" mc:Ignorable="w14 wp14">
+  <w:p>
+    <w:pPr>
+      <w:pStyle w:val="Footer"/>
+      <w:jc w:val="center"/>
+    </w:pPr>
+    <w:r>
+      <w:rPr>
+        <w:rFonts w:ascii="Calibri" w:hAnsi="Calibri"/>
+        <w:color w:val="5A5A65"/>
+        <w:sz w:val="16"/>
+      </w:rPr>
+      <w:t xml:space="preserve">Page </w:t>
+    </w:r>
+    <w:r>
+      <w:fldChar w:fldCharType="begin"/>
+    </w:r>
+    <w:r>
+      <w:rPr>
+        <w:rFonts w:ascii="Calibri" w:hAnsi="Calibri"/>
+        <w:color w:val="5A5A65"/>
+        <w:sz w:val="16"/>
+      </w:rPr>
+      <w:instrText xml:space="preserve"> PAGE </w:instrText>
+    </w:r>
+    <w:r>
+      <w:fldChar w:fldCharType="end"/>
+    </w:r>
+    <w:r>
+      <w:rPr>
+        <w:rFonts w:ascii="Calibri" w:hAnsi="Calibri"/>
+        <w:color w:val="5A5A65"/>
+        <w:sz w:val="16"/>
+      </w:rPr>
+      <w:t xml:space="preserve"> of </w:t>
+    </w:r>
+    <w:r>
+      <w:fldChar w:fldCharType="begin"/>
+    </w:r>
+    <w:r>
+      <w:rPr>
+        <w:rFonts w:ascii="Calibri" w:hAnsi="Calibri"/>
+        <w:color w:val="5A5A65"/>
+        <w:sz w:val="16"/>
+      </w:rPr>
+      <w:instrText xml:space="preserve"> NUMPAGES </w:instrText>
+    </w:r>
+    <w:r>
+      <w:fldChar w:fldCharType="end"/>
+    </w:r>
+  </w:p>
+</w:ftr>
+</file>
+
+<file path=word/header1.xml><?xml version="1.0" encoding="utf-8"?>
+<w:hdr xmlns:m="http://schemas.openxmlformats.org/officeDocument/2006/math" xmlns:mc="http://schemas.openxmlformats.org/markup-compatibility/2006" xmlns:mo="http://schemas.microsoft.com/office/mac/office/2008/main" xmlns:mv="urn:schemas-microsoft-com:mac:vml" xmlns:o="urn:schemas-microsoft-com:office:office" xmlns:r="http://schemas.openxmlformats.org/officeDocument/2006/relationships" xmlns:v="urn:schemas-microsoft-com:vml" xmlns:w10="urn:schemas-microsoft-com:office:word" xmlns:w14="http://schemas.microsoft.com/office/word/2010/wordml" xmlns:w="http://schemas.openxmlformats.org/wordprocessingml/2006/main" xmlns:wne="http://schemas.microsoft.com/office/word/2006/wordml" xmlns:wp14="http://schemas.microsoft.com/office/word/2010/wordprocessingDrawing" xmlns:wp="http://schemas.openxmlformats.org/drawingml/2006/wordprocessingDrawing" xmlns:wpc="http://schemas.microsoft.com/office/word/2010/wordprocessingCanvas" xmlns:wpg="http://schemas.microsoft.com/office/word/2010/wordprocessingGroup" xmlns:wpi="http://schemas.microsoft.com/office/word/2010/wordprocessingInk" xmlns:wps="http://schemas.microsoft.com/office/word/2010/wordprocessingShape" mc:Ignorable="w14 wp14">
+  <w:p>
+    <w:pPr>
+      <w:pStyle w:val="Header"/>
+      <w:jc w:val="right"/>
+      <w:pBdr>
+        <w:bottom w:val="single" w:sz="4" w:space="1" w:color="D0D0D8"/>
+      </w:pBdr>
+    </w:pPr>
+    <w:r>
+      <w:rPr>
+        <w:rFonts w:ascii="Calibri" w:hAnsi="Calibri"/>
+        <w:color w:val="5A5A65"/>
+        <w:sz w:val="16"/>
+      </w:rPr>
+      <w:t>Data Quality Review</w:t>
+    </w:r>
+    <w:r>
+      <w:rPr>
+        <w:rFonts w:ascii="Calibri" w:hAnsi="Calibri"/>
+        <w:color w:val="D0D0D8"/>
+        <w:sz w:val="16"/>
+      </w:rPr>
+      <w:t xml:space="preserve">  |  {{CUSTOMER}}</w:t>
+    </w:r>
+  </w:p>
+</w:hdr>
 </file>
 
 <file path=word/numbering.xml><?xml version="1.0" encoding="utf-8"?>
@@ -870,9 +1935,13 @@
     <w:name w:val="Normal"/>
     <w:qFormat/>
     <w:rsid w:val="00FC693F"/>
+    <w:pPr>
+      <w:spacing w:after="120" w:line="276" w:lineRule="auto"/>
+    </w:pPr>
     <w:rPr>
       <w:rFonts w:ascii="Calibri" w:hAnsi="Calibri"/>
-      <w:sz w:val="22"/>
+      <w:color w:val="33333B"/>
+      <w:sz w:val="21"/>
     </w:rPr>
   </w:style>
   <w:style w:type="paragraph" w:styleId="Header">
@@ -930,15 +1999,15 @@
     <w:pPr>
       <w:keepNext/>
       <w:keepLines/>
-      <w:spacing w:before="480" w:after="0"/>
+      <w:spacing w:before="480" w:after="160"/>
       <w:outlineLvl w:val="0"/>
     </w:pPr>
     <w:rPr>
-      <w:rFonts w:asciiTheme="majorHAnsi" w:eastAsiaTheme="majorEastAsia" w:hAnsiTheme="majorHAnsi" w:cstheme="majorBidi"/>
-      <w:b/>
+      <w:rFonts w:asciiTheme="majorHAnsi" w:eastAsiaTheme="majorEastAsia" w:hAnsiTheme="majorHAnsi" w:cstheme="majorBidi" w:ascii="Calibri Light" w:hAnsi="Calibri Light"/>
+      <w:b w:val="0"/>
       <w:bCs/>
-      <w:color w:val="365F91" w:themeColor="accent1" w:themeShade="BF"/>
-      <w:sz w:val="28"/>
+      <w:color w:val="1B2A4A"/>
+      <w:sz w:val="44"/>
       <w:szCs w:val="28"/>
     </w:rPr>
   </w:style>
@@ -954,15 +2023,15 @@
     <w:pPr>
       <w:keepNext/>
       <w:keepLines/>
-      <w:spacing w:before="200" w:after="0"/>
+      <w:spacing w:before="360" w:after="120"/>
       <w:outlineLvl w:val="1"/>
     </w:pPr>
     <w:rPr>
-      <w:rFonts w:asciiTheme="majorHAnsi" w:eastAsiaTheme="majorEastAsia" w:hAnsiTheme="majorHAnsi" w:cstheme="majorBidi"/>
-      <w:b/>
+      <w:rFonts w:asciiTheme="majorHAnsi" w:eastAsiaTheme="majorEastAsia" w:hAnsiTheme="majorHAnsi" w:cstheme="majorBidi" w:ascii="Calibri Light" w:hAnsi="Calibri Light"/>
+      <w:b w:val="0"/>
       <w:bCs/>
-      <w:color w:val="4F81BD" w:themeColor="accent1"/>
-      <w:sz w:val="26"/>
+      <w:color w:val="2E5C8A"/>
+      <w:sz w:val="32"/>
       <w:szCs w:val="26"/>
     </w:rPr>
   </w:style>
@@ -978,14 +2047,15 @@
     <w:pPr>
       <w:keepNext/>
       <w:keepLines/>
-      <w:spacing w:before="200" w:after="0"/>
+      <w:spacing w:before="240" w:after="80"/>
       <w:outlineLvl w:val="2"/>
     </w:pPr>
     <w:rPr>
-      <w:rFonts w:asciiTheme="majorHAnsi" w:eastAsiaTheme="majorEastAsia" w:hAnsiTheme="majorHAnsi" w:cstheme="majorBidi"/>
+      <w:rFonts w:asciiTheme="majorHAnsi" w:eastAsiaTheme="majorEastAsia" w:hAnsiTheme="majorHAnsi" w:cstheme="majorBidi" w:ascii="Calibri" w:hAnsi="Calibri"/>
       <w:b/>
       <w:bCs/>
-      <w:color w:val="4F81BD" w:themeColor="accent1"/>
+      <w:color w:val="2E5C8A"/>
+      <w:sz w:val="24"/>
     </w:rPr>
   </w:style>
   <w:style w:type="paragraph" w:styleId="Heading4">
@@ -1401,8 +2471,14 @@
       <w:numPr>
         <w:numId w:val="1"/>
       </w:numPr>
+      <w:spacing w:after="60"/>
       <w:contextualSpacing/>
     </w:pPr>
+    <w:rPr>
+      <w:rFonts w:ascii="Calibri" w:hAnsi="Calibri"/>
+      <w:color w:val="33333B"/>
+      <w:sz w:val="21"/>
+    </w:rPr>
   </w:style>
   <w:style w:type="paragraph" w:styleId="ListBullet2">
     <w:name w:val="List Bullet 2"/>

</xml_diff>